<commit_message>
Update IJMR final submission assets with repo-linked declarations
</commit_message>
<xml_diff>
--- a/kaggle/dataset/manuscript/IJMR_DEAI_declarations_2026-04-23.docx
+++ b/kaggle/dataset/manuscript/IJMR_DEAI_declarations_2026-04-23.docx
@@ -103,7 +103,7 @@
         </w:rPr>
         <w:t>Data availability:</w:t>
         <w:br/>
-        <w:t>Derived tables, figures, and scripts are available in the project workspace. Source public data are available from LASI/IIPS and related public reports.</w:t>
+        <w:t>Derived tables, figures, reproducible scripts, and the public release package are available at https://github.com/hssling/deai-ecological-validation-india. Source public data are available from LASI/IIPS and related public reports.</w:t>
       </w:r>
     </w:p>
     <w:p>
@@ -129,7 +129,20 @@
         </w:rPr>
         <w:t>Declaration of AI in scientific writing:</w:t>
         <w:br/>
-        <w:t>Computational tools were used for data processing, reproducible analysis, document assembly, and formatting support. Final responsibility for the scientific content rests with the author.</w:t>
+        <w:t>Computational tools were used for data processing, reproducible analysis, document assembly, language editing support, and formatting support. Final responsibility for the scientific content rests with the author.</w:t>
+      </w:r>
+    </w:p>
+    <w:p>
+      <w:pPr>
+        <w:jc w:val="both"/>
+      </w:pPr>
+      <w:r>
+        <w:rPr>
+          <w:rFonts w:ascii="Times New Roman" w:hAnsi="Times New Roman"/>
+        </w:rPr>
+        <w:t>Data sharing statement:</w:t>
+        <w:br/>
+        <w:t>The curated public release, including reproducible analysis files, manuscript assets, and supporting tables and figures, is available at https://github.com/hssling/deai-ecological-validation-india.</w:t>
       </w:r>
     </w:p>
     <w:sectPr>

</xml_diff>